<commit_message>
Add kappa sensitivity analysis per professor's feedback
Sweep kappa from 0.001 to 5.0 measuring cost gap between linear
and power-law strategies. Confirms second failure mode of the
linear model: high urgency, complementing the beta failure mode.

Co-Authored-By: Claude Opus 4.7 (1M context) <noreply@anthropic.com>
</commit_message>
<xml_diff>
--- a/presentation/report.docx
+++ b/presentation/report.docx
@@ -1138,6 +1138,126 @@
           <w:rFonts w:ascii="Calibri" w:hAnsi="Calibri"/>
           <w:b/>
           <w:color w:val="0B2D5C"/>
+          <w:sz w:val="24"/>
+        </w:rPr>
+        <w:t>4.5  Cost gap as a function of urgency (κ)</w:t>
+      </w:r>
+    </w:p>
+    <w:p>
+      <w:pPr>
+        <w:spacing w:after="80"/>
+        <w:jc w:val="both"/>
+      </w:pPr>
+      <w:r>
+        <w:rPr>
+          <w:rFonts w:ascii="Calibri" w:hAnsi="Calibri"/>
+          <w:sz w:val="22"/>
+        </w:rPr>
+        <w:t>Following feedback from our project review, we extended the sensitivity analysis to study how the cost gap varies with the urgency parameter κ. Recall that κ = √(γσ²/η) bundles risk aversion, volatility, and impact cost into a single number. A small κ describes a patient liquidation; a large κ describes an urgent one.</w:t>
+      </w:r>
+    </w:p>
+    <w:p>
+      <w:pPr>
+        <w:spacing w:after="80"/>
+        <w:jc w:val="both"/>
+      </w:pPr>
+      <w:r>
+        <w:rPr>
+          <w:rFonts w:ascii="Calibri" w:hAnsi="Calibri"/>
+          <w:sz w:val="22"/>
+        </w:rPr>
+        <w:t>We swept κ across nine values from 0.001 (very patient) to 5.0 (extremely urgent), holding σ and η at baseline and adjusting γ accordingly. At each κ we computed both the linear and power-law (β = 0.6) optimal trajectories, then evaluated the linear trajectory under the power-law cost function. The resulting gap quantifies the certainty-equivalent excess cost of using the linear strategy when reality follows a power-law impact rule.</w:t>
+      </w:r>
+    </w:p>
+    <w:p>
+      <w:pPr>
+        <w:jc w:val="center"/>
+      </w:pPr>
+      <w:r>
+        <w:drawing>
+          <wp:inline xmlns:a="http://schemas.openxmlformats.org/drawingml/2006/main" xmlns:pic="http://schemas.openxmlformats.org/drawingml/2006/picture">
+            <wp:extent cx="5303520" cy="2894726"/>
+            <wp:docPr id="4" name="Picture 4"/>
+            <wp:cNvGraphicFramePr>
+              <a:graphicFrameLocks noChangeAspect="1"/>
+            </wp:cNvGraphicFramePr>
+            <a:graphic>
+              <a:graphicData uri="http://schemas.openxmlformats.org/drawingml/2006/picture">
+                <pic:pic>
+                  <pic:nvPicPr>
+                    <pic:cNvPr id="0" name="cost_gap_vs_kappa.png"/>
+                    <pic:cNvPicPr/>
+                  </pic:nvPicPr>
+                  <pic:blipFill>
+                    <a:blip r:embed="rId12"/>
+                    <a:stretch>
+                      <a:fillRect/>
+                    </a:stretch>
+                  </pic:blipFill>
+                  <pic:spPr>
+                    <a:xfrm>
+                      <a:off x="0" y="0"/>
+                      <a:ext cx="5303520" cy="2894726"/>
+                    </a:xfrm>
+                    <a:prstGeom prst="rect"/>
+                  </pic:spPr>
+                </pic:pic>
+              </a:graphicData>
+            </a:graphic>
+          </wp:inline>
+        </w:drawing>
+      </w:r>
+    </w:p>
+    <w:p>
+      <w:pPr>
+        <w:spacing w:after="200"/>
+        <w:jc w:val="center"/>
+      </w:pPr>
+      <w:r>
+        <w:rPr>
+          <w:rFonts w:ascii="Calibri" w:hAnsi="Calibri"/>
+          <w:i/>
+          <w:color w:val="555E6B"/>
+          <w:sz w:val="18"/>
+        </w:rPr>
+        <w:t>Figure 4. Transaction cost gap as a function of urgency κ. Both absolute (red, left axis) and relative (blue dashed, right axis) representations are shown. The gap is small in the patient regime but grows substantially as κ rises.</w:t>
+      </w:r>
+    </w:p>
+    <w:p>
+      <w:pPr>
+        <w:spacing w:after="80"/>
+        <w:jc w:val="both"/>
+      </w:pPr>
+      <w:r>
+        <w:rPr>
+          <w:rFonts w:ascii="Calibri" w:hAnsi="Calibri"/>
+          <w:sz w:val="22"/>
+        </w:rPr>
+        <w:t>The chart confirms what we observed in the γ trajectory comparison: when liquidation is patient, both models produce near-identical costs, but as urgency rises the linear model's misspecification of impact becomes increasingly expensive. Combined with the β sensitivity in §4.3, this shows two distinct failure modes of the linear model: it breaks down when impact is highly non-linear (low β) OR when liquidation is urgent (high κ). In a real execution context, both can occur simultaneously.</w:t>
+      </w:r>
+    </w:p>
+    <w:p>
+      <w:pPr>
+        <w:spacing w:after="80"/>
+        <w:jc w:val="both"/>
+      </w:pPr>
+      <w:r>
+        <w:rPr>
+          <w:rFonts w:ascii="Calibri" w:hAnsi="Calibri"/>
+          <w:sz w:val="22"/>
+        </w:rPr>
+        <w:t>Technical subtlety: the curve is non-monotone, peaking around κ ≈ 0.5–1.0 and shrinking again at κ = 5. At extreme urgency both strategies are forced toward immediate liquidation, so the shapes converge and the relative cost gap contracts.</w:t>
+      </w:r>
+    </w:p>
+    <w:p>
+      <w:pPr>
+        <w:spacing w:before="160" w:after="60"/>
+      </w:pPr>
+      <w:r>
+        <w:rPr>
+          <w:rFonts w:ascii="Calibri" w:hAnsi="Calibri"/>
+          <w:b/>
+          <w:color w:val="0B2D5C"/>
           <w:sz w:val="26"/>
         </w:rPr>
         <w:t>5.  Discussion &amp; Conclusion</w:t>

</xml_diff>

<commit_message>
Add two-line kappa chart per professor's wording
The professor asked for a chart showing 'different transaction cost
outcomes' across kappa. The original kappa sweep showed only the gap.
This adds the literal version: both strategies' total costs on the
same axes, log scale, with regime annotations.

Co-Authored-By: Claude Opus 4.7 (1M context) <noreply@anthropic.com>
</commit_message>
<xml_diff>
--- a/presentation/report.docx
+++ b/presentation/report.docx
@@ -1225,6 +1225,73 @@
     </w:p>
     <w:p>
       <w:pPr>
+        <w:jc w:val="center"/>
+      </w:pPr>
+      <w:r>
+        <w:drawing>
+          <wp:inline xmlns:a="http://schemas.openxmlformats.org/drawingml/2006/main" xmlns:pic="http://schemas.openxmlformats.org/drawingml/2006/picture">
+            <wp:extent cx="5303520" cy="2897431"/>
+            <wp:docPr id="5" name="Picture 5"/>
+            <wp:cNvGraphicFramePr>
+              <a:graphicFrameLocks noChangeAspect="1"/>
+            </wp:cNvGraphicFramePr>
+            <a:graphic>
+              <a:graphicData uri="http://schemas.openxmlformats.org/drawingml/2006/picture">
+                <pic:pic>
+                  <pic:nvPicPr>
+                    <pic:cNvPr id="0" name="cost_vs_kappa_two_line.png"/>
+                    <pic:cNvPicPr/>
+                  </pic:nvPicPr>
+                  <pic:blipFill>
+                    <a:blip r:embed="rId13"/>
+                    <a:stretch>
+                      <a:fillRect/>
+                    </a:stretch>
+                  </pic:blipFill>
+                  <pic:spPr>
+                    <a:xfrm>
+                      <a:off x="0" y="0"/>
+                      <a:ext cx="5303520" cy="2897431"/>
+                    </a:xfrm>
+                    <a:prstGeom prst="rect"/>
+                  </pic:spPr>
+                </pic:pic>
+              </a:graphicData>
+            </a:graphic>
+          </wp:inline>
+        </w:drawing>
+      </w:r>
+    </w:p>
+    <w:p>
+      <w:pPr>
+        <w:spacing w:after="200"/>
+        <w:jc w:val="center"/>
+      </w:pPr>
+      <w:r>
+        <w:rPr>
+          <w:rFonts w:ascii="Calibri" w:hAnsi="Calibri"/>
+          <w:i/>
+          <w:color w:val="555E6B"/>
+          <w:sz w:val="18"/>
+        </w:rPr>
+        <w:t>Figure 5. Transaction costs of the linear and power-law strategies plotted across the κ range. The vertical separation between the two lines is the cost gap shown in Figure 4.</w:t>
+      </w:r>
+    </w:p>
+    <w:p>
+      <w:pPr>
+        <w:spacing w:after="80"/>
+        <w:jc w:val="both"/>
+      </w:pPr>
+      <w:r>
+        <w:rPr>
+          <w:rFonts w:ascii="Calibri" w:hAnsi="Calibri"/>
+          <w:sz w:val="22"/>
+        </w:rPr>
+        <w:t>Figure 5 presents the same κ sweep in absolute cost terms rather than relative gap. Both strategies' total transaction costs are plotted on a logarithmic axis. The visual divergence makes the practical scale of the disagreement clear: at moderate urgency the linear strategy can cost orders of magnitude more than the power-law optimum. At very high κ, both strategies converge as the optimal action becomes near-immediate liquidation under both impact models.</w:t>
+      </w:r>
+    </w:p>
+    <w:p>
+      <w:pPr>
         <w:spacing w:after="80"/>
         <w:jc w:val="both"/>
       </w:pPr>

</xml_diff>

<commit_message>
Remove author names from body of report
Names now appear only on the title page authors line, per
standard academic formatting. Headers, table labels, and
prose are name-free.

Co-Authored-By: Claude Opus 4.7 (1M context) <noreply@anthropic.com>
</commit_message>
<xml_diff>
--- a/presentation/report.docx
+++ b/presentation/report.docx
@@ -464,7 +464,7 @@
           </w:tcPr>
           <w:p>
             <w:r>
-              <w:t>Linear (Ali)</w:t>
+              <w:t>Linear</w:t>
             </w:r>
           </w:p>
         </w:tc>
@@ -506,7 +506,7 @@
           </w:tcPr>
           <w:p>
             <w:r>
-              <w:t>Linear (Ali)</w:t>
+              <w:t>Linear</w:t>
             </w:r>
           </w:p>
         </w:tc>

</xml_diff>

<commit_message>
Clean report: names on title page only, table labels describe model not implementation
Removed personal names (Ali, Mohamed) from headers, table labels, and prose
throughout the body. Solver names (CVXPY, SLSQP) kept where they describe
methodology genuinely; removed where they were noise on result labels.

Co-Authored-By: Claude Opus 4.7 (1M context) <noreply@anthropic.com>
</commit_message>
<xml_diff>
--- a/presentation/report.docx
+++ b/presentation/report.docx
@@ -309,7 +309,7 @@
           <w:rFonts w:ascii="Calibri" w:hAnsi="Calibri"/>
           <w:sz w:val="22"/>
         </w:rPr>
-        <w:t>At baseline γ the linear model produces a near-straight-line trajectory — κN ≈ 0.35 is small, so the sinh curve is almost linear and the schedule is close to TWAP (~20,000 shares per interval). The CVXPY-verified power-law trajectory at β = 0.6 is meaningfully more front-loaded than SLSQP had estimated: v_1 ≈ 28,588 shares vs. SLSQP's 21,909.</w:t>
+        <w:t>At baseline γ the linear model produces a near-straight-line trajectory — κN ≈ 0.35 is small, so the sinh curve is almost linear and the schedule is close to TWAP (~20,000 shares per interval). The power-law trajectory at β = 0.6 is meaningfully more front-loaded than SLSQP had estimated: v_1 ≈ 28,588 shares vs. SLSQP's 21,909.</w:t>
       </w:r>
     </w:p>
     <w:p>
@@ -548,7 +548,7 @@
           </w:tcPr>
           <w:p>
             <w:r>
-              <w:t>Power-law (CVXPY)</w:t>
+              <w:t>Power-law</w:t>
             </w:r>
           </w:p>
         </w:tc>
@@ -590,7 +590,7 @@
           </w:tcPr>
           <w:p>
             <w:r>
-              <w:t>Power-law (CVXPY)</w:t>
+              <w:t>Power-law</w:t>
             </w:r>
           </w:p>
         </w:tc>
@@ -732,7 +732,7 @@
           <w:color w:val="555E6B"/>
           <w:sz w:val="18"/>
         </w:rPr>
-        <w:t>Figure 2. Certainty-equivalent objective gap of the linear trajectory under the true power-law model, as a function of β. CVXPY-verified.</w:t>
+        <w:t>Figure 2. Certainty-equivalent objective gap of the linear trajectory under the true power-law model, as a function of β.</w:t>
       </w:r>
     </w:p>
     <w:tbl>

</xml_diff>